<commit_message>
++++ML_VIDEO++++:What is hyper parameter, hyper parameter tuning and types of hyper parameter tuning
</commit_message>
<xml_diff>
--- a/machine_learning_basics/mlbasics_test.docx
+++ b/machine_learning_basics/mlbasics_test.docx
@@ -9,12 +9,33 @@
     </w:p>
     <w:p>
       <w:r>
-        <w:t>2. How can we import decision tree and kMean clustering sklearn</w:t>
-      </w:r>
-    </w:p>
-    <w:p>
-      <w:r>
-        <w:t>3. What is KNN, Does it can be used for both classification and regression?</w:t>
+        <w:t xml:space="preserve">2. How can we import decision tree and </w:t>
+      </w:r>
+      <w:proofErr w:type="spellStart"/>
+      <w:r>
+        <w:t>kMean</w:t>
+      </w:r>
+      <w:proofErr w:type="spellEnd"/>
+      <w:r>
+        <w:t xml:space="preserve"> clustering </w:t>
+      </w:r>
+      <w:proofErr w:type="spellStart"/>
+      <w:r>
+        <w:t>sklearn</w:t>
+      </w:r>
+      <w:proofErr w:type="spellEnd"/>
+    </w:p>
+    <w:p>
+      <w:r>
+        <w:t xml:space="preserve">3. What is KNN, </w:t>
+      </w:r>
+      <w:proofErr w:type="gramStart"/>
+      <w:r>
+        <w:t>Does</w:t>
+      </w:r>
+      <w:proofErr w:type="gramEnd"/>
+      <w:r>
+        <w:t xml:space="preserve"> it can be used for both classification and regression?</w:t>
       </w:r>
     </w:p>
     <w:p>
@@ -90,6 +111,24 @@
     <w:p>
       <w:r>
         <w:t>14. Types of classification</w:t>
+      </w:r>
+    </w:p>
+    <w:p>
+      <w:r>
+        <w:t xml:space="preserve">15. What is hype parameter, hyper parameter tuning and </w:t>
+      </w:r>
+      <w:proofErr w:type="gramStart"/>
+      <w:r>
+        <w:t>it’s</w:t>
+      </w:r>
+      <w:proofErr w:type="gramEnd"/>
+      <w:r>
+        <w:t xml:space="preserve"> types?</w:t>
+      </w:r>
+    </w:p>
+    <w:p>
+      <w:r>
+        <w:t>16. Difference between GS CV, RS CV?</w:t>
       </w:r>
     </w:p>
     <w:p/>
@@ -272,6 +311,7 @@
           <w:b/>
           <w:bCs/>
         </w:rPr>
+        <w:lastRenderedPageBreak/>
         <w:t>For Regression KNN</w:t>
       </w:r>
     </w:p>
@@ -291,7 +331,6 @@
         <w:rPr>
           <w:noProof/>
         </w:rPr>
-        <w:lastRenderedPageBreak/>
         <w:drawing>
           <wp:inline distT="0" distB="0" distL="0" distR="0" wp14:anchorId="0DABF042" wp14:editId="157BE785">
             <wp:extent cx="2078182" cy="1505050"/>
@@ -398,7 +437,15 @@
     </w:p>
     <w:p>
       <w:r>
-        <w:t>In below formula P is number of input variables. N total number of`samples.</w:t>
+        <w:t xml:space="preserve">In below formula P is number of input variables. N total number </w:t>
+      </w:r>
+      <w:proofErr w:type="spellStart"/>
+      <w:r>
+        <w:t>of`samples</w:t>
+      </w:r>
+      <w:proofErr w:type="spellEnd"/>
+      <w:r>
+        <w:t>.</w:t>
       </w:r>
     </w:p>
     <w:p>
@@ -642,8 +689,23 @@
         <w:t>) to +1(perfect positive</w:t>
       </w:r>
       <w:r>
-        <w:t xml:space="preserve"> x,y will increased</w:t>
-      </w:r>
+        <w:t xml:space="preserve"> </w:t>
+      </w:r>
+      <w:proofErr w:type="spellStart"/>
+      <w:proofErr w:type="gramStart"/>
+      <w:r>
+        <w:t>x,y</w:t>
+      </w:r>
+      <w:proofErr w:type="spellEnd"/>
+      <w:proofErr w:type="gramEnd"/>
+      <w:r>
+        <w:t xml:space="preserve"> will </w:t>
+      </w:r>
+      <w:proofErr w:type="gramStart"/>
+      <w:r>
+        <w:t>increased</w:t>
+      </w:r>
+      <w:proofErr w:type="gramEnd"/>
       <w:r>
         <w:t>), with 0 indicating no linear correlation.</w:t>
       </w:r>
@@ -778,7 +840,21 @@
           <w:lang w:val="en-US"/>
         </w:rPr>
         <w:lastRenderedPageBreak/>
-        <w:t xml:space="preserve">For all kind of regression model we have to give highly corelated fields with target variable is important, we have to pick a feature that has correlation greater than or equal to the 0.5, in the below describes the house price prediction correlation, the target label price has highly correlated with the feature called room size, so this needs to be give to the model for training, if we give less correlated feature than the model’s accuracy will be </w:t>
+        <w:t xml:space="preserve">For all kind of regression model we have to give highly corelated fields with target variable is important, we have to pick a feature that has correlation greater than or equal to the 0.5, in the below describes the house price prediction correlation, the target label price has highly correlated with the feature called room size, so this needs to be </w:t>
+      </w:r>
+      <w:proofErr w:type="spellStart"/>
+      <w:r>
+        <w:rPr>
+          <w:lang w:val="en-US"/>
+        </w:rPr>
+        <w:t>give</w:t>
+      </w:r>
+      <w:proofErr w:type="spellEnd"/>
+      <w:r>
+        <w:rPr>
+          <w:lang w:val="en-US"/>
+        </w:rPr>
+        <w:t xml:space="preserve"> to the model for training, if we give less correlated feature than the model’s accuracy will be </w:t>
       </w:r>
       <w:r>
         <w:rPr>
@@ -878,23 +954,40 @@
         <w:t>80,20</w:t>
       </w:r>
       <w:r>
-        <w:t xml:space="preserve"> ratio. </w:t>
-      </w:r>
-    </w:p>
-    <w:p>
-      <w:pPr>
-        <w:rPr>
-          <w:b/>
-          <w:bCs/>
-        </w:rPr>
-      </w:pPr>
-      <w:r>
-        <w:rPr>
-          <w:b/>
-          <w:bCs/>
-        </w:rPr>
-        <w:t>In kfold</w:t>
-      </w:r>
+        <w:t xml:space="preserve"> </w:t>
+      </w:r>
+      <w:proofErr w:type="gramStart"/>
+      <w:r>
+        <w:t>ratio</w:t>
+      </w:r>
+      <w:proofErr w:type="gramEnd"/>
+      <w:r>
+        <w:t xml:space="preserve">. </w:t>
+      </w:r>
+    </w:p>
+    <w:p>
+      <w:pPr>
+        <w:rPr>
+          <w:b/>
+          <w:bCs/>
+        </w:rPr>
+      </w:pPr>
+      <w:r>
+        <w:rPr>
+          <w:b/>
+          <w:bCs/>
+        </w:rPr>
+        <w:t xml:space="preserve">In </w:t>
+      </w:r>
+      <w:proofErr w:type="spellStart"/>
+      <w:r>
+        <w:rPr>
+          <w:b/>
+          <w:bCs/>
+        </w:rPr>
+        <w:t>kfold</w:t>
+      </w:r>
+      <w:proofErr w:type="spellEnd"/>
       <w:r>
         <w:t xml:space="preserve"> all the red box will be the validation data. </w:t>
       </w:r>
@@ -1015,7 +1108,15 @@
         <w:t xml:space="preserve">. </w:t>
       </w:r>
       <w:r>
-        <w:t>If we have 100 rows for data the iteration of this k-fold validation will be 100, on each iteration it takes only on data for test, So in first iteration only the first row will be used for test, and second iteration second row will be used for test and so on.</w:t>
+        <w:t xml:space="preserve">If we have 100 rows for data the iteration of this k-fold validation will be 100, on each iteration it takes only on data for test, </w:t>
+      </w:r>
+      <w:proofErr w:type="gramStart"/>
+      <w:r>
+        <w:t>So</w:t>
+      </w:r>
+      <w:proofErr w:type="gramEnd"/>
+      <w:r>
+        <w:t xml:space="preserve"> in first iteration only the first row will be used for test, and second iteration second row will be used for test and so on.</w:t>
       </w:r>
     </w:p>
     <w:p>
@@ -1054,7 +1155,23 @@
           <w:b/>
           <w:bCs/>
         </w:rPr>
-        <w:t xml:space="preserve"> P number of data for test</w:t>
+        <w:t xml:space="preserve"> P </w:t>
+      </w:r>
+      <w:proofErr w:type="gramStart"/>
+      <w:r>
+        <w:rPr>
+          <w:b/>
+          <w:bCs/>
+        </w:rPr>
+        <w:t>number</w:t>
+      </w:r>
+      <w:proofErr w:type="gramEnd"/>
+      <w:r>
+        <w:rPr>
+          <w:b/>
+          <w:bCs/>
+        </w:rPr>
+        <w:t xml:space="preserve"> of data for test</w:t>
       </w:r>
       <w:r>
         <w:rPr>
@@ -1064,7 +1181,15 @@
         <w:t>ing</w:t>
       </w:r>
       <w:r>
-        <w:t>, if the p is 3 then it will take only 3 row for each iteration fold.</w:t>
+        <w:t xml:space="preserve">, if the p is 3 then it will take only 3 </w:t>
+      </w:r>
+      <w:proofErr w:type="gramStart"/>
+      <w:r>
+        <w:t>row</w:t>
+      </w:r>
+      <w:proofErr w:type="gramEnd"/>
+      <w:r>
+        <w:t xml:space="preserve"> for each iteration fold.</w:t>
       </w:r>
     </w:p>
     <w:p/>
@@ -1077,7 +1202,15 @@
         <w:t xml:space="preserve">11. </w:t>
       </w:r>
       <w:r>
-        <w:t>It is one of the supervised learning technique that some feature</w:t>
+        <w:t xml:space="preserve">It is one of the supervised learning </w:t>
+      </w:r>
+      <w:proofErr w:type="gramStart"/>
+      <w:r>
+        <w:t>technique</w:t>
+      </w:r>
+      <w:proofErr w:type="gramEnd"/>
+      <w:r>
+        <w:t xml:space="preserve"> that some feature</w:t>
       </w:r>
     </w:p>
     <w:p>
@@ -1135,7 +1268,15 @@
     </w:p>
     <w:p>
       <w:r>
-        <w:t>                      young  middle   senior</w:t>
+        <w:t xml:space="preserve">                      </w:t>
+      </w:r>
+      <w:proofErr w:type="gramStart"/>
+      <w:r>
+        <w:t>young  middle</w:t>
+      </w:r>
+      <w:proofErr w:type="gramEnd"/>
+      <w:r>
+        <w:t xml:space="preserve">   senior</w:t>
       </w:r>
     </w:p>
     <w:p>
@@ -1257,8 +1398,21 @@
         <w:lastRenderedPageBreak/>
         <w:t xml:space="preserve">      </w:t>
       </w:r>
-      <w:r>
-        <w:t>Non linear regression - Non linear combination of input like (curve)</w:t>
+      <w:proofErr w:type="spellStart"/>
+      <w:r>
+        <w:t>Non linear</w:t>
+      </w:r>
+      <w:proofErr w:type="spellEnd"/>
+      <w:r>
+        <w:t xml:space="preserve"> regression - </w:t>
+      </w:r>
+      <w:proofErr w:type="spellStart"/>
+      <w:r>
+        <w:t>Non linear</w:t>
+      </w:r>
+      <w:proofErr w:type="spellEnd"/>
+      <w:r>
+        <w:t xml:space="preserve"> combination of input like (curve)</w:t>
       </w:r>
     </w:p>
     <w:p>
@@ -1278,7 +1432,15 @@
     </w:p>
     <w:p>
       <w:r>
-        <w:t>                            So this is used to fit curved line model's</w:t>
+        <w:t xml:space="preserve">                            </w:t>
+      </w:r>
+      <w:proofErr w:type="gramStart"/>
+      <w:r>
+        <w:t>So</w:t>
+      </w:r>
+      <w:proofErr w:type="gramEnd"/>
+      <w:r>
+        <w:t xml:space="preserve"> this is used to fit curved line model's</w:t>
       </w:r>
     </w:p>
     <w:p>
@@ -1313,11 +1475,22 @@
     </w:p>
     <w:p>
       <w:r>
-        <w:t>for degree 3 y = b0 + b1x + b2x**2 + b3x**3 .... +bnx**n</w:t>
-      </w:r>
-    </w:p>
-    <w:p>
-      <w:r>
+        <w:t>for degree 3 y = b0 + b1x + b2x**2 + b3x**3 .... +</w:t>
+      </w:r>
+      <w:proofErr w:type="spellStart"/>
+      <w:r>
+        <w:t>bnx</w:t>
+      </w:r>
+      <w:proofErr w:type="spellEnd"/>
+      <w:r>
+        <w:t>**n</w:t>
+      </w:r>
+    </w:p>
+    <w:p>
+      <w:r>
+        <w:rPr>
+          <w:noProof/>
+        </w:rPr>
         <w:drawing>
           <wp:inline distT="0" distB="0" distL="0" distR="0" wp14:anchorId="7060A75D" wp14:editId="777A9059">
             <wp:extent cx="4648200" cy="3206099"/>
@@ -1357,6 +1530,9 @@
     </w:p>
     <w:p>
       <w:r>
+        <w:rPr>
+          <w:noProof/>
+        </w:rPr>
         <w:drawing>
           <wp:inline distT="0" distB="0" distL="0" distR="0" wp14:anchorId="1D66B2B9" wp14:editId="4373B9FD">
             <wp:extent cx="3713018" cy="1491554"/>
@@ -1408,7 +1584,15 @@
     </w:p>
     <w:p>
       <w:r>
-        <w:t> occurred, the are fitted while training, but while we trying to see</w:t>
+        <w:t xml:space="preserve"> occurred, </w:t>
+      </w:r>
+      <w:proofErr w:type="spellStart"/>
+      <w:r>
+        <w:t>the</w:t>
+      </w:r>
+      <w:proofErr w:type="spellEnd"/>
+      <w:r>
+        <w:t xml:space="preserve"> are fitted while training, but while we trying to see</w:t>
       </w:r>
     </w:p>
     <w:p>
@@ -1464,6 +1648,7 @@
         <w:rPr>
           <w:b/>
           <w:bCs/>
+          <w:noProof/>
         </w:rPr>
         <w:drawing>
           <wp:inline distT="0" distB="0" distL="0" distR="0" wp14:anchorId="4028110E" wp14:editId="50FB24BB">
@@ -1513,6 +1698,7 @@
         <w:rPr>
           <w:b/>
           <w:bCs/>
+          <w:noProof/>
         </w:rPr>
         <w:drawing>
           <wp:inline distT="0" distB="0" distL="0" distR="0" wp14:anchorId="4289A490" wp14:editId="7A519F2B">
@@ -1550,6 +1736,245 @@
           </wp:inline>
         </w:drawing>
       </w:r>
+    </w:p>
+    <w:p>
+      <w:pPr>
+        <w:rPr>
+          <w:b/>
+          <w:bCs/>
+        </w:rPr>
+      </w:pPr>
+      <w:r>
+        <w:rPr>
+          <w:b/>
+          <w:bCs/>
+        </w:rPr>
+        <w:t xml:space="preserve">15. </w:t>
+      </w:r>
+    </w:p>
+    <w:p>
+      <w:pPr>
+        <w:rPr>
+          <w:b/>
+          <w:bCs/>
+        </w:rPr>
+      </w:pPr>
+      <w:r>
+        <w:rPr>
+          <w:noProof/>
+        </w:rPr>
+        <w:drawing>
+          <wp:inline distT="0" distB="0" distL="0" distR="0" wp14:anchorId="7F0A7830" wp14:editId="5C53A4EA">
+            <wp:extent cx="2175164" cy="1631373"/>
+            <wp:effectExtent l="0" t="0" r="0" b="6985"/>
+            <wp:docPr id="1491547921" name="Picture 1"/>
+            <wp:cNvGraphicFramePr>
+              <a:graphicFrameLocks xmlns:a="http://schemas.openxmlformats.org/drawingml/2006/main" noChangeAspect="1"/>
+            </wp:cNvGraphicFramePr>
+            <a:graphic xmlns:a="http://schemas.openxmlformats.org/drawingml/2006/main">
+              <a:graphicData uri="http://schemas.openxmlformats.org/drawingml/2006/picture">
+                <pic:pic xmlns:pic="http://schemas.openxmlformats.org/drawingml/2006/picture">
+                  <pic:nvPicPr>
+                    <pic:cNvPr id="1491547921" name=""/>
+                    <pic:cNvPicPr/>
+                  </pic:nvPicPr>
+                  <pic:blipFill>
+                    <a:blip r:embed="rId20"/>
+                    <a:stretch>
+                      <a:fillRect/>
+                    </a:stretch>
+                  </pic:blipFill>
+                  <pic:spPr>
+                    <a:xfrm>
+                      <a:off x="0" y="0"/>
+                      <a:ext cx="2180496" cy="1635372"/>
+                    </a:xfrm>
+                    <a:prstGeom prst="rect">
+                      <a:avLst/>
+                    </a:prstGeom>
+                  </pic:spPr>
+                </pic:pic>
+              </a:graphicData>
+            </a:graphic>
+          </wp:inline>
+        </w:drawing>
+      </w:r>
+    </w:p>
+    <w:p>
+      <w:r>
+        <w:t xml:space="preserve">In linear regression x is the input y is the output that we are going to predict, m and c are the parameters with that help of that y will be predicted, so the optimal value to predict y can’t be find in </w:t>
+      </w:r>
+      <w:r>
+        <w:lastRenderedPageBreak/>
+        <w:t xml:space="preserve">learning stage of the model. </w:t>
+      </w:r>
+      <w:proofErr w:type="gramStart"/>
+      <w:r>
+        <w:t>So</w:t>
+      </w:r>
+      <w:proofErr w:type="gramEnd"/>
+      <w:r>
+        <w:t xml:space="preserve"> we have to </w:t>
+      </w:r>
+      <w:proofErr w:type="gramStart"/>
+      <w:r>
+        <w:t>the this</w:t>
+      </w:r>
+      <w:proofErr w:type="gramEnd"/>
+      <w:r>
+        <w:t xml:space="preserve"> hyper parameter to predict y, that is called hyper parameter tuning.</w:t>
+      </w:r>
+    </w:p>
+    <w:p>
+      <w:pPr>
+        <w:rPr>
+          <w:b/>
+          <w:bCs/>
+        </w:rPr>
+      </w:pPr>
+      <w:r>
+        <w:rPr>
+          <w:b/>
+          <w:bCs/>
+        </w:rPr>
+        <w:t>Summary:</w:t>
+      </w:r>
+    </w:p>
+    <w:p>
+      <w:r>
+        <w:t>Hyper parameter tuning is the process of changing the parameters of the model (weight) to predict the values in desired way. And it can be changed externally.</w:t>
+      </w:r>
+    </w:p>
+    <w:p>
+      <w:pPr>
+        <w:rPr>
+          <w:b/>
+          <w:bCs/>
+        </w:rPr>
+      </w:pPr>
+      <w:r>
+        <w:rPr>
+          <w:b/>
+          <w:bCs/>
+          <w:noProof/>
+        </w:rPr>
+        <w:drawing>
+          <wp:anchor distT="0" distB="0" distL="114300" distR="114300" simplePos="0" relativeHeight="251658240" behindDoc="0" locked="0" layoutInCell="1" allowOverlap="1" wp14:anchorId="6060F6E9" wp14:editId="688D66F6">
+            <wp:simplePos x="914400" y="2140527"/>
+            <wp:positionH relativeFrom="column">
+              <wp:align>left</wp:align>
+            </wp:positionH>
+            <wp:positionV relativeFrom="paragraph">
+              <wp:align>top</wp:align>
+            </wp:positionV>
+            <wp:extent cx="1929110" cy="1711037"/>
+            <wp:effectExtent l="0" t="0" r="0" b="3810"/>
+            <wp:wrapSquare wrapText="bothSides"/>
+            <wp:docPr id="1696310674" name="Picture 1"/>
+            <wp:cNvGraphicFramePr>
+              <a:graphicFrameLocks xmlns:a="http://schemas.openxmlformats.org/drawingml/2006/main" noChangeAspect="1"/>
+            </wp:cNvGraphicFramePr>
+            <a:graphic xmlns:a="http://schemas.openxmlformats.org/drawingml/2006/main">
+              <a:graphicData uri="http://schemas.openxmlformats.org/drawingml/2006/picture">
+                <pic:pic xmlns:pic="http://schemas.openxmlformats.org/drawingml/2006/picture">
+                  <pic:nvPicPr>
+                    <pic:cNvPr id="1696310674" name=""/>
+                    <pic:cNvPicPr/>
+                  </pic:nvPicPr>
+                  <pic:blipFill>
+                    <a:blip r:embed="rId21">
+                      <a:extLst>
+                        <a:ext uri="{28A0092B-C50C-407E-A947-70E740481C1C}">
+                          <a14:useLocalDpi xmlns:a14="http://schemas.microsoft.com/office/drawing/2010/main" val="0"/>
+                        </a:ext>
+                      </a:extLst>
+                    </a:blip>
+                    <a:stretch>
+                      <a:fillRect/>
+                    </a:stretch>
+                  </pic:blipFill>
+                  <pic:spPr>
+                    <a:xfrm>
+                      <a:off x="0" y="0"/>
+                      <a:ext cx="1929110" cy="1711037"/>
+                    </a:xfrm>
+                    <a:prstGeom prst="rect">
+                      <a:avLst/>
+                    </a:prstGeom>
+                  </pic:spPr>
+                </pic:pic>
+              </a:graphicData>
+            </a:graphic>
+          </wp:anchor>
+        </w:drawing>
+      </w:r>
+    </w:p>
+    <w:p/>
+    <w:p/>
+    <w:p/>
+    <w:p>
+      <w:pPr>
+        <w:tabs>
+          <w:tab w:val="left" w:pos="1156"/>
+        </w:tabs>
+        <w:rPr>
+          <w:b/>
+          <w:bCs/>
+        </w:rPr>
+      </w:pPr>
+      <w:r>
+        <w:rPr>
+          <w:b/>
+          <w:bCs/>
+        </w:rPr>
+        <w:tab/>
+      </w:r>
+    </w:p>
+    <w:p>
+      <w:pPr>
+        <w:tabs>
+          <w:tab w:val="left" w:pos="1156"/>
+        </w:tabs>
+        <w:rPr>
+          <w:b/>
+          <w:bCs/>
+        </w:rPr>
+      </w:pPr>
+    </w:p>
+    <w:p>
+      <w:pPr>
+        <w:rPr>
+          <w:b/>
+          <w:bCs/>
+        </w:rPr>
+      </w:pPr>
+      <w:r>
+        <w:rPr>
+          <w:b/>
+          <w:bCs/>
+        </w:rPr>
+        <w:br w:type="textWrapping" w:clear="all"/>
+      </w:r>
+    </w:p>
+    <w:p>
+      <w:r>
+        <w:rPr>
+          <w:b/>
+          <w:bCs/>
+        </w:rPr>
+        <w:t xml:space="preserve">16. </w:t>
+      </w:r>
+      <w:r>
+        <w:t>Finds the best hyper parameter in faster way in random search while grid takes time.</w:t>
+      </w:r>
+    </w:p>
+    <w:p>
+      <w:pPr>
+        <w:rPr>
+          <w:b/>
+          <w:bCs/>
+        </w:rPr>
+      </w:pPr>
     </w:p>
     <w:p/>
     <w:p/>
@@ -2189,6 +2614,7 @@
   <w:style w:type="character" w:default="1" w:styleId="DefaultParagraphFont">
     <w:name w:val="Default Paragraph Font"/>
     <w:uiPriority w:val="1"/>
+    <w:semiHidden/>
     <w:unhideWhenUsed/>
   </w:style>
   <w:style w:type="table" w:default="1" w:styleId="TableNormal">

</xml_diff>

<commit_message>
Example code for SVM
</commit_message>
<xml_diff>
--- a/machine_learning_basics/mlbasics_test.docx
+++ b/machine_learning_basics/mlbasics_test.docx
@@ -9,33 +9,12 @@
     </w:p>
     <w:p>
       <w:r>
-        <w:t xml:space="preserve">2. How can we import decision tree and </w:t>
-      </w:r>
-      <w:proofErr w:type="spellStart"/>
-      <w:r>
-        <w:t>kMean</w:t>
-      </w:r>
-      <w:proofErr w:type="spellEnd"/>
-      <w:r>
-        <w:t xml:space="preserve"> clustering </w:t>
-      </w:r>
-      <w:proofErr w:type="spellStart"/>
-      <w:r>
-        <w:t>sklearn</w:t>
-      </w:r>
-      <w:proofErr w:type="spellEnd"/>
-    </w:p>
-    <w:p>
-      <w:r>
-        <w:t xml:space="preserve">3. What is KNN, </w:t>
-      </w:r>
-      <w:proofErr w:type="gramStart"/>
-      <w:r>
-        <w:t>Does</w:t>
-      </w:r>
-      <w:proofErr w:type="gramEnd"/>
-      <w:r>
-        <w:t xml:space="preserve"> it can be used for both classification and regression?</w:t>
+        <w:t>2. How can we import decision tree and kMean clustering sklearn</w:t>
+      </w:r>
+    </w:p>
+    <w:p>
+      <w:r>
+        <w:t>3. What is KNN, Does it can be used for both classification and regression?</w:t>
       </w:r>
     </w:p>
     <w:p>
@@ -118,15 +97,7 @@
     </w:p>
     <w:p>
       <w:r>
-        <w:t xml:space="preserve">15. What is hype parameter, hyper parameter tuning and </w:t>
-      </w:r>
-      <w:proofErr w:type="gramStart"/>
-      <w:r>
-        <w:t>it’s</w:t>
-      </w:r>
-      <w:proofErr w:type="gramEnd"/>
-      <w:r>
-        <w:t xml:space="preserve"> types?</w:t>
+        <w:t>15. What is hype parameter, hyper parameter tuning and it’s types?</w:t>
       </w:r>
     </w:p>
     <w:p>
@@ -152,15 +123,7 @@
     </w:p>
     <w:p>
       <w:r>
-        <w:t xml:space="preserve">19. What </w:t>
-      </w:r>
-      <w:proofErr w:type="gramStart"/>
-      <w:r>
-        <w:t>are</w:t>
-      </w:r>
-      <w:proofErr w:type="gramEnd"/>
-      <w:r>
-        <w:t xml:space="preserve"> the evaluating metric</w:t>
+        <w:t>19. What are the evaluating metric</w:t>
       </w:r>
     </w:p>
     <w:p>
@@ -180,23 +143,7 @@
     </w:p>
     <w:p>
       <w:r>
-        <w:t xml:space="preserve">23. What is Naïve Bayes? Does it will have independent features, </w:t>
-      </w:r>
-      <w:proofErr w:type="gramStart"/>
-      <w:r>
-        <w:t>What</w:t>
-      </w:r>
-      <w:proofErr w:type="gramEnd"/>
-      <w:r>
-        <w:t xml:space="preserve"> is the use of conditional probability in naïve, </w:t>
-      </w:r>
-      <w:proofErr w:type="gramStart"/>
-      <w:r>
-        <w:t>In</w:t>
-      </w:r>
-      <w:proofErr w:type="gramEnd"/>
-      <w:r>
-        <w:t xml:space="preserve"> which area naïve are used.</w:t>
+        <w:t>23. What is Naïve Bayes? Does it will have independent features, What is the use of conditional probability in naïve, In which area naïve are used.</w:t>
       </w:r>
       <w:r>
         <w:t xml:space="preserve"> What is likelihood and prior</w:t>
@@ -224,6 +171,11 @@
       </w:r>
       <w:r>
         <w:t>What is the use of polynomial kernel function, radial kernel function?</w:t>
+      </w:r>
+    </w:p>
+    <w:p>
+      <w:r>
+        <w:t>27. How can you use svm from sicikit learn with kernel function, and what is the use of c hyper parameter in svm.</w:t>
       </w:r>
     </w:p>
     <w:p/>
@@ -237,6 +189,7 @@
         </w:rPr>
       </w:pPr>
       <w:r>
+        <w:lastRenderedPageBreak/>
         <w:t>-------------------------------------------------------------------------------------------------------------------------------------</w:t>
       </w:r>
       <w:r>
@@ -251,7 +204,6 @@
     </w:p>
     <w:p>
       <w:r>
-        <w:lastRenderedPageBreak/>
         <w:t>3. Yes</w:t>
       </w:r>
     </w:p>
@@ -532,15 +484,7 @@
     </w:p>
     <w:p>
       <w:r>
-        <w:t xml:space="preserve">In below formula P is number of input variables. N total number </w:t>
-      </w:r>
-      <w:proofErr w:type="spellStart"/>
-      <w:r>
-        <w:t>of`samples</w:t>
-      </w:r>
-      <w:proofErr w:type="spellEnd"/>
-      <w:r>
-        <w:t>.</w:t>
+        <w:t>In below formula P is number of input variables. N total number of`samples.</w:t>
       </w:r>
     </w:p>
     <w:p>
@@ -784,23 +728,8 @@
         <w:t>) to +1(perfect positive</w:t>
       </w:r>
       <w:r>
-        <w:t xml:space="preserve"> </w:t>
-      </w:r>
-      <w:proofErr w:type="spellStart"/>
-      <w:proofErr w:type="gramStart"/>
-      <w:r>
-        <w:t>x,y</w:t>
-      </w:r>
-      <w:proofErr w:type="spellEnd"/>
-      <w:proofErr w:type="gramEnd"/>
-      <w:r>
-        <w:t xml:space="preserve"> will </w:t>
-      </w:r>
-      <w:proofErr w:type="gramStart"/>
-      <w:r>
-        <w:t>increased</w:t>
-      </w:r>
-      <w:proofErr w:type="gramEnd"/>
+        <w:t xml:space="preserve"> x,y will increased</w:t>
+      </w:r>
       <w:r>
         <w:t>), with 0 indicating no linear correlation.</w:t>
       </w:r>
@@ -935,21 +864,7 @@
         <w:rPr>
           <w:lang w:val="en-US"/>
         </w:rPr>
-        <w:t xml:space="preserve">For all kind of regression model we have to give highly corelated fields with target variable is important, we have to pick a feature that has correlation greater than or equal to the 0.5, in the below describes the house price prediction correlation, the target label price has highly correlated with the feature called room size, so this needs to be </w:t>
-      </w:r>
-      <w:proofErr w:type="spellStart"/>
-      <w:r>
-        <w:rPr>
-          <w:lang w:val="en-US"/>
-        </w:rPr>
-        <w:t>give</w:t>
-      </w:r>
-      <w:proofErr w:type="spellEnd"/>
-      <w:r>
-        <w:rPr>
-          <w:lang w:val="en-US"/>
-        </w:rPr>
-        <w:t xml:space="preserve"> to the model for training, if we give less correlated feature than the model’s accuracy will be </w:t>
+        <w:t xml:space="preserve">For all kind of regression model we have to give highly corelated fields with target variable is important, we have to pick a feature that has correlation greater than or equal to the 0.5, in the below describes the house price prediction correlation, the target label price has highly correlated with the feature called room size, so this needs to be give to the model for training, if we give less correlated feature than the model’s accuracy will be </w:t>
       </w:r>
       <w:r>
         <w:rPr>
@@ -1049,40 +964,23 @@
         <w:t>80,20</w:t>
       </w:r>
       <w:r>
-        <w:t xml:space="preserve"> </w:t>
-      </w:r>
-      <w:proofErr w:type="gramStart"/>
-      <w:r>
-        <w:t>ratio</w:t>
-      </w:r>
-      <w:proofErr w:type="gramEnd"/>
-      <w:r>
-        <w:t xml:space="preserve">. </w:t>
-      </w:r>
-    </w:p>
-    <w:p>
-      <w:pPr>
-        <w:rPr>
-          <w:b/>
-          <w:bCs/>
-        </w:rPr>
-      </w:pPr>
-      <w:r>
-        <w:rPr>
-          <w:b/>
-          <w:bCs/>
-        </w:rPr>
-        <w:t xml:space="preserve">In </w:t>
-      </w:r>
-      <w:proofErr w:type="spellStart"/>
-      <w:r>
-        <w:rPr>
-          <w:b/>
-          <w:bCs/>
-        </w:rPr>
-        <w:t>kfold</w:t>
-      </w:r>
-      <w:proofErr w:type="spellEnd"/>
+        <w:t xml:space="preserve"> ratio. </w:t>
+      </w:r>
+    </w:p>
+    <w:p>
+      <w:pPr>
+        <w:rPr>
+          <w:b/>
+          <w:bCs/>
+        </w:rPr>
+      </w:pPr>
+      <w:r>
+        <w:rPr>
+          <w:b/>
+          <w:bCs/>
+        </w:rPr>
+        <w:t>In kfold</w:t>
+      </w:r>
       <w:r>
         <w:t xml:space="preserve"> all the red box will be the validation data. </w:t>
       </w:r>
@@ -1204,15 +1102,7 @@
         <w:t xml:space="preserve">. </w:t>
       </w:r>
       <w:r>
-        <w:t xml:space="preserve">If we have 100 rows for data the iteration of this k-fold validation will be 100, on each iteration it takes only on data for test, </w:t>
-      </w:r>
-      <w:proofErr w:type="gramStart"/>
-      <w:r>
-        <w:t>So</w:t>
-      </w:r>
-      <w:proofErr w:type="gramEnd"/>
-      <w:r>
-        <w:t xml:space="preserve"> in first iteration only the first row will be used for test, and second iteration second row will be used for test and so on.</w:t>
+        <w:t>If we have 100 rows for data the iteration of this k-fold validation will be 100, on each iteration it takes only on data for test, So in first iteration only the first row will be used for test, and second iteration second row will be used for test and so on.</w:t>
       </w:r>
     </w:p>
     <w:p>
@@ -1251,23 +1141,7 @@
           <w:b/>
           <w:bCs/>
         </w:rPr>
-        <w:t xml:space="preserve"> P </w:t>
-      </w:r>
-      <w:proofErr w:type="gramStart"/>
-      <w:r>
-        <w:rPr>
-          <w:b/>
-          <w:bCs/>
-        </w:rPr>
-        <w:t>number</w:t>
-      </w:r>
-      <w:proofErr w:type="gramEnd"/>
-      <w:r>
-        <w:rPr>
-          <w:b/>
-          <w:bCs/>
-        </w:rPr>
-        <w:t xml:space="preserve"> of data for test</w:t>
+        <w:t xml:space="preserve"> P number of data for test</w:t>
       </w:r>
       <w:r>
         <w:rPr>
@@ -1277,15 +1151,7 @@
         <w:t>ing</w:t>
       </w:r>
       <w:r>
-        <w:t xml:space="preserve">, if the p is 3 then it will take only 3 </w:t>
-      </w:r>
-      <w:proofErr w:type="gramStart"/>
-      <w:r>
-        <w:t>row</w:t>
-      </w:r>
-      <w:proofErr w:type="gramEnd"/>
-      <w:r>
-        <w:t xml:space="preserve"> for each iteration fold.</w:t>
+        <w:t>, if the p is 3 then it will take only 3 row for each iteration fold.</w:t>
       </w:r>
     </w:p>
     <w:p/>
@@ -1298,15 +1164,13 @@
         <w:t xml:space="preserve">11. </w:t>
       </w:r>
       <w:r>
-        <w:t xml:space="preserve">It is one of the supervised learning </w:t>
-      </w:r>
-      <w:proofErr w:type="gramStart"/>
-      <w:r>
-        <w:t>technique</w:t>
-      </w:r>
-      <w:proofErr w:type="gramEnd"/>
-      <w:r>
-        <w:t xml:space="preserve"> that some feature</w:t>
+        <w:t xml:space="preserve">It is one of the supervised learning technique that </w:t>
+      </w:r>
+      <w:r>
+        <w:t xml:space="preserve">takes </w:t>
+      </w:r>
+      <w:r>
+        <w:t>some feature</w:t>
       </w:r>
     </w:p>
     <w:p>
@@ -1363,15 +1227,7 @@
     </w:p>
     <w:p>
       <w:r>
-        <w:t xml:space="preserve">                      </w:t>
-      </w:r>
-      <w:proofErr w:type="gramStart"/>
-      <w:r>
-        <w:t>young  middle</w:t>
-      </w:r>
-      <w:proofErr w:type="gramEnd"/>
-      <w:r>
-        <w:t xml:space="preserve">   senior</w:t>
+        <w:t>                      young  middle   senior</w:t>
       </w:r>
     </w:p>
     <w:p>
@@ -1493,21 +1349,8 @@
       <w:r>
         <w:t xml:space="preserve">      </w:t>
       </w:r>
-      <w:proofErr w:type="spellStart"/>
-      <w:r>
-        <w:t>Non linear</w:t>
-      </w:r>
-      <w:proofErr w:type="spellEnd"/>
-      <w:r>
-        <w:t xml:space="preserve"> regression - </w:t>
-      </w:r>
-      <w:proofErr w:type="spellStart"/>
-      <w:r>
-        <w:t>Non linear</w:t>
-      </w:r>
-      <w:proofErr w:type="spellEnd"/>
-      <w:r>
-        <w:t xml:space="preserve"> combination of input like (curve)</w:t>
+      <w:r>
+        <w:t>Non linear regression - Non linear combination of input like (curve)</w:t>
       </w:r>
     </w:p>
     <w:p>
@@ -1527,15 +1370,7 @@
     </w:p>
     <w:p>
       <w:r>
-        <w:t xml:space="preserve">                            </w:t>
-      </w:r>
-      <w:proofErr w:type="gramStart"/>
-      <w:r>
-        <w:t>So</w:t>
-      </w:r>
-      <w:proofErr w:type="gramEnd"/>
-      <w:r>
-        <w:t xml:space="preserve"> this is used to fit curved line model's</w:t>
+        <w:t>                            So this is used to fit curved line model's</w:t>
       </w:r>
     </w:p>
     <w:p>
@@ -1570,15 +1405,7 @@
     </w:p>
     <w:p>
       <w:r>
-        <w:t>for degree 3 y = b0 + b1x + b2x**2 + b3x**3 .... +</w:t>
-      </w:r>
-      <w:proofErr w:type="spellStart"/>
-      <w:r>
-        <w:t>bnx</w:t>
-      </w:r>
-      <w:proofErr w:type="spellEnd"/>
-      <w:r>
-        <w:t>**n</w:t>
+        <w:t>for degree 3 y = b0 + b1x + b2x**2 + b3x**3 .... +bnx**n</w:t>
       </w:r>
     </w:p>
     <w:p>
@@ -1680,15 +1507,7 @@
     </w:p>
     <w:p>
       <w:r>
-        <w:t xml:space="preserve"> occurred, </w:t>
-      </w:r>
-      <w:proofErr w:type="spellStart"/>
-      <w:r>
-        <w:t>the</w:t>
-      </w:r>
-      <w:proofErr w:type="spellEnd"/>
-      <w:r>
-        <w:t xml:space="preserve"> are fitted while training, but while we trying to see</w:t>
+        <w:t> occurred, the are fitted while training, but while we trying to see</w:t>
       </w:r>
     </w:p>
     <w:p>
@@ -1898,23 +1717,7 @@
     </w:p>
     <w:p>
       <w:r>
-        <w:t xml:space="preserve">In linear regression x is the input y is the output that we are going to predict, m and c are the parameters with that help of that y will be predicted, so the optimal value to predict y can’t be find in learning stage of the model. </w:t>
-      </w:r>
-      <w:proofErr w:type="gramStart"/>
-      <w:r>
-        <w:t>So</w:t>
-      </w:r>
-      <w:proofErr w:type="gramEnd"/>
-      <w:r>
-        <w:t xml:space="preserve"> we have to </w:t>
-      </w:r>
-      <w:proofErr w:type="gramStart"/>
-      <w:r>
-        <w:t>the this</w:t>
-      </w:r>
-      <w:proofErr w:type="gramEnd"/>
-      <w:r>
-        <w:t xml:space="preserve"> hyper parameter to predict y, that is called hyper parameter tuning.</w:t>
+        <w:t>In linear regression x is the input y is the output that we are going to predict, m and c are the parameters with that help of that y will be predicted, so the optimal value to predict y can’t be find in learning stage of the model. So we have to the this hyper parameter to predict y, that is called hyper parameter tuning.</w:t>
       </w:r>
     </w:p>
     <w:p>
@@ -2189,15 +1992,7 @@
     </w:p>
     <w:p>
       <w:r>
-        <w:t xml:space="preserve"> input </w:t>
-      </w:r>
-      <w:proofErr w:type="gramStart"/>
-      <w:r>
-        <w:t>is belongs</w:t>
-      </w:r>
-      <w:proofErr w:type="gramEnd"/>
-      <w:r>
-        <w:t xml:space="preserve"> to some class.</w:t>
+        <w:t> input is belongs to some class.</w:t>
       </w:r>
     </w:p>
     <w:p/>
@@ -2218,15 +2013,7 @@
     </w:p>
     <w:p>
       <w:r>
-        <w:t> </w:t>
-      </w:r>
-      <w:proofErr w:type="gramStart"/>
-      <w:r>
-        <w:t>so</w:t>
-      </w:r>
-      <w:proofErr w:type="gramEnd"/>
-      <w:r>
-        <w:t xml:space="preserve"> it uses sigmoid function, which put any real number into the </w:t>
+        <w:t xml:space="preserve"> so it uses sigmoid function, which put any real number into the </w:t>
       </w:r>
     </w:p>
     <w:p>
@@ -2237,31 +2024,7 @@
     <w:p/>
     <w:p>
       <w:r>
-        <w:t xml:space="preserve"> It </w:t>
-      </w:r>
-      <w:proofErr w:type="gramStart"/>
-      <w:r>
-        <w:t>uses  1</w:t>
-      </w:r>
-      <w:proofErr w:type="gramEnd"/>
-      <w:r>
-        <w:t>/1+(e)-</w:t>
-      </w:r>
-      <w:proofErr w:type="gramStart"/>
-      <w:r>
-        <w:t>z  where</w:t>
-      </w:r>
-      <w:proofErr w:type="gramEnd"/>
-      <w:r>
-        <w:t xml:space="preserve"> z= </w:t>
-      </w:r>
-      <w:proofErr w:type="spellStart"/>
-      <w:r>
-        <w:t>wX+b</w:t>
-      </w:r>
-      <w:proofErr w:type="spellEnd"/>
-      <w:r>
-        <w:t xml:space="preserve"> </w:t>
+        <w:t xml:space="preserve"> It uses  1/1+(e)-z  where z= wX+b </w:t>
       </w:r>
     </w:p>
     <w:p>
@@ -2402,28 +2165,12 @@
     <w:p/>
     <w:p>
       <w:r>
-        <w:t xml:space="preserve">                              In a </w:t>
-      </w:r>
-      <w:proofErr w:type="gramStart"/>
-      <w:r>
-        <w:t>cancer based</w:t>
-      </w:r>
-      <w:proofErr w:type="gramEnd"/>
-      <w:r>
-        <w:t xml:space="preserve"> system a model doesn't predicts</w:t>
-      </w:r>
-    </w:p>
-    <w:p>
-      <w:r>
-        <w:t xml:space="preserve">                              the person who </w:t>
-      </w:r>
-      <w:proofErr w:type="gramStart"/>
-      <w:r>
-        <w:t>have</w:t>
-      </w:r>
-      <w:proofErr w:type="gramEnd"/>
-      <w:r>
-        <w:t xml:space="preserve"> cancer will make huge risk. </w:t>
+        <w:t>                              In a cancer based system a model doesn't predicts</w:t>
+      </w:r>
+    </w:p>
+    <w:p>
+      <w:r>
+        <w:t xml:space="preserve">                              the person who have cancer will make huge risk. </w:t>
       </w:r>
     </w:p>
     <w:p/>
@@ -2477,28 +2224,12 @@
     </w:p>
     <w:p>
       <w:r>
-        <w:t> </w:t>
-      </w:r>
-      <w:proofErr w:type="gramStart"/>
-      <w:r>
-        <w:t>still</w:t>
-      </w:r>
-      <w:proofErr w:type="gramEnd"/>
-      <w:r>
-        <w:t xml:space="preserve"> some of the techniques that can be used on torch to give the</w:t>
-      </w:r>
-    </w:p>
-    <w:p>
-      <w:r>
-        <w:t xml:space="preserve"> same good prediction </w:t>
-      </w:r>
-      <w:proofErr w:type="gramStart"/>
-      <w:r>
-        <w:t>result</w:t>
-      </w:r>
-      <w:proofErr w:type="gramEnd"/>
-      <w:r>
-        <w:t xml:space="preserve"> to all users.</w:t>
+        <w:t> still some of the techniques that can be used on torch to give the</w:t>
+      </w:r>
+    </w:p>
+    <w:p>
+      <w:r>
+        <w:t> same good prediction result to all users.</w:t>
       </w:r>
     </w:p>
     <w:p>
@@ -2660,7 +2391,6 @@
       </w:r>
     </w:p>
     <w:p>
-      <w:proofErr w:type="gramStart"/>
       <w:r>
         <w:t xml:space="preserve">  </w:t>
       </w:r>
@@ -2669,15 +2399,7 @@
           <w:b/>
           <w:bCs/>
         </w:rPr>
-        <w:t>Poisson</w:t>
-      </w:r>
-      <w:proofErr w:type="gramEnd"/>
-      <w:r>
-        <w:rPr>
-          <w:b/>
-          <w:bCs/>
-        </w:rPr>
-        <w:t xml:space="preserve"> distribution</w:t>
+        <w:t>Poisson distribution</w:t>
       </w:r>
       <w:r>
         <w:t>: Models the number of times an event happens in a fixed interval of time or space.</w:t>
@@ -2690,146 +2412,87 @@
           <w:i/>
           <w:iCs/>
         </w:rPr>
-        <w:t xml:space="preserve">Example: Number of customer calls received per hour at a call </w:t>
-      </w:r>
-      <w:proofErr w:type="spellStart"/>
+        <w:t>Example: Number of customer calls received per hour at a call center.</w:t>
+      </w:r>
+    </w:p>
+    <w:p>
+      <w:r>
+        <w:t xml:space="preserve">  </w:t>
+      </w:r>
+      <w:r>
+        <w:rPr>
+          <w:b/>
+          <w:bCs/>
+        </w:rPr>
+        <w:t>Binomial distribution</w:t>
+      </w:r>
+      <w:r>
+        <w:t>: Models the number of successes in a fixed number of independent yes/no trials.</w:t>
+      </w:r>
+      <w:r>
+        <w:br/>
+      </w:r>
       <w:r>
         <w:rPr>
           <w:i/>
           <w:iCs/>
         </w:rPr>
-        <w:t>center</w:t>
-      </w:r>
-      <w:proofErr w:type="spellEnd"/>
+        <w:t>Example: Number of heads in 10 coin tosses.</w:t>
+      </w:r>
+    </w:p>
+    <w:p>
+      <w:r>
+        <w:t xml:space="preserve">  </w:t>
+      </w:r>
+      <w:r>
+        <w:rPr>
+          <w:b/>
+          <w:bCs/>
+        </w:rPr>
+        <w:t>Exponential distribution</w:t>
+      </w:r>
+      <w:r>
+        <w:t>: Models the time between events in a Poisson process.</w:t>
+      </w:r>
+      <w:r>
+        <w:br/>
+      </w:r>
       <w:r>
         <w:rPr>
           <w:i/>
           <w:iCs/>
         </w:rPr>
-        <w:t>.</w:t>
-      </w:r>
-    </w:p>
-    <w:p>
-      <w:proofErr w:type="gramStart"/>
-      <w:r>
-        <w:t xml:space="preserve">  </w:t>
-      </w:r>
-      <w:r>
-        <w:rPr>
-          <w:b/>
-          <w:bCs/>
-        </w:rPr>
-        <w:t>Binomial</w:t>
-      </w:r>
-      <w:proofErr w:type="gramEnd"/>
-      <w:r>
-        <w:rPr>
-          <w:b/>
-          <w:bCs/>
-        </w:rPr>
-        <w:t xml:space="preserve"> distribution</w:t>
-      </w:r>
-      <w:r>
-        <w:t>: Models the number of successes in a fixed number of independent yes/no trials.</w:t>
-      </w:r>
-      <w:r>
-        <w:br/>
-      </w:r>
-      <w:r>
+        <w:t>Example: Time between incoming calls at a help desk.</w:t>
+      </w:r>
+    </w:p>
+    <w:p>
+      <w:pPr>
         <w:rPr>
           <w:i/>
           <w:iCs/>
         </w:rPr>
-        <w:t xml:space="preserve">Example: Number of heads in </w:t>
-      </w:r>
-      <w:proofErr w:type="gramStart"/>
+      </w:pPr>
+      <w:r>
+        <w:t xml:space="preserve">  </w:t>
+      </w:r>
+      <w:r>
+        <w:rPr>
+          <w:b/>
+          <w:bCs/>
+        </w:rPr>
+        <w:t>Negative binomial distribution</w:t>
+      </w:r>
+      <w:r>
+        <w:t>: Models the number of trials needed to get a fixed number of successes.</w:t>
+      </w:r>
+      <w:r>
+        <w:br/>
+      </w:r>
       <w:r>
         <w:rPr>
           <w:i/>
           <w:iCs/>
         </w:rPr>
-        <w:t>10 coin</w:t>
-      </w:r>
-      <w:proofErr w:type="gramEnd"/>
-      <w:r>
-        <w:rPr>
-          <w:i/>
-          <w:iCs/>
-        </w:rPr>
-        <w:t xml:space="preserve"> tosses.</w:t>
-      </w:r>
-    </w:p>
-    <w:p>
-      <w:proofErr w:type="gramStart"/>
-      <w:r>
-        <w:t xml:space="preserve">  </w:t>
-      </w:r>
-      <w:r>
-        <w:rPr>
-          <w:b/>
-          <w:bCs/>
-        </w:rPr>
-        <w:t>Exponential</w:t>
-      </w:r>
-      <w:proofErr w:type="gramEnd"/>
-      <w:r>
-        <w:rPr>
-          <w:b/>
-          <w:bCs/>
-        </w:rPr>
-        <w:t xml:space="preserve"> distribution</w:t>
-      </w:r>
-      <w:r>
-        <w:t>: Models the time between events in a Poisson process.</w:t>
-      </w:r>
-      <w:r>
-        <w:br/>
-      </w:r>
-      <w:r>
-        <w:rPr>
-          <w:i/>
-          <w:iCs/>
-        </w:rPr>
-        <w:t>Example: Time between incoming calls at a help desk.</w:t>
-      </w:r>
-    </w:p>
-    <w:p>
-      <w:pPr>
-        <w:rPr>
-          <w:i/>
-          <w:iCs/>
-        </w:rPr>
-      </w:pPr>
-      <w:proofErr w:type="gramStart"/>
-      <w:r>
-        <w:t xml:space="preserve">  </w:t>
-      </w:r>
-      <w:r>
-        <w:rPr>
-          <w:b/>
-          <w:bCs/>
-        </w:rPr>
-        <w:t>Negative</w:t>
-      </w:r>
-      <w:proofErr w:type="gramEnd"/>
-      <w:r>
-        <w:rPr>
-          <w:b/>
-          <w:bCs/>
-        </w:rPr>
-        <w:t xml:space="preserve"> binomial distribution</w:t>
-      </w:r>
-      <w:r>
-        <w:t>: Models the number of trials needed to get a fixed number of successes.</w:t>
-      </w:r>
-      <w:r>
-        <w:br/>
-      </w:r>
-      <w:r>
-        <w:rPr>
-          <w:i/>
-          <w:iCs/>
-        </w:rPr>
         <w:t>Example: Number of coin tosses needed to get 3 heads.</w:t>
       </w:r>
     </w:p>
@@ -2905,21 +2568,7 @@
         <w:rPr>
           <w:lang w:val="en-US"/>
         </w:rPr>
-        <w:t xml:space="preserve">: In binary classification problem we predict labels as 0 and 1, we will conclude if the value is less than threshold then the person has no diabetes, if a value is greater than threshold then the person has diabetes. That is what describes in below image, </w:t>
-      </w:r>
-      <w:proofErr w:type="gramStart"/>
-      <w:r>
-        <w:rPr>
-          <w:lang w:val="en-US"/>
-        </w:rPr>
-        <w:t>We</w:t>
-      </w:r>
-      <w:proofErr w:type="gramEnd"/>
-      <w:r>
-        <w:rPr>
-          <w:lang w:val="en-US"/>
-        </w:rPr>
-        <w:t xml:space="preserve"> will increase or decrease the threshold value to get good prediction</w:t>
+        <w:t>: In binary classification problem we predict labels as 0 and 1, we will conclude if the value is less than threshold then the person has no diabetes, if a value is greater than threshold then the person has diabetes. That is what describes in below image, We will increase or decrease the threshold value to get good prediction</w:t>
       </w:r>
     </w:p>
     <w:p>
@@ -2981,49 +2630,7 @@
         <w:rPr>
           <w:lang w:val="en-US"/>
         </w:rPr>
-        <w:t xml:space="preserve">With ROC curve we will find confusion Metrix for this each threshold, the curved line </w:t>
-      </w:r>
-      <w:proofErr w:type="gramStart"/>
-      <w:r>
-        <w:rPr>
-          <w:lang w:val="en-US"/>
-        </w:rPr>
-        <w:t>are</w:t>
-      </w:r>
-      <w:proofErr w:type="gramEnd"/>
-      <w:r>
-        <w:rPr>
-          <w:lang w:val="en-US"/>
-        </w:rPr>
-        <w:t xml:space="preserve"> called ROC curve and the space under the curved line are called AUC, In Roc curve we will </w:t>
-      </w:r>
-      <w:proofErr w:type="spellStart"/>
-      <w:r>
-        <w:rPr>
-          <w:lang w:val="en-US"/>
-        </w:rPr>
-        <w:t>pot</w:t>
-      </w:r>
-      <w:proofErr w:type="spellEnd"/>
-      <w:r>
-        <w:rPr>
-          <w:lang w:val="en-US"/>
-        </w:rPr>
-        <w:t xml:space="preserve"> the True positive rate on y axis and False </w:t>
-      </w:r>
-      <w:proofErr w:type="gramStart"/>
-      <w:r>
-        <w:rPr>
-          <w:lang w:val="en-US"/>
-        </w:rPr>
-        <w:t>positive(</w:t>
-      </w:r>
-      <w:proofErr w:type="gramEnd"/>
-      <w:r>
-        <w:rPr>
-          <w:lang w:val="en-US"/>
-        </w:rPr>
-        <w:t>wrong predictions) on x axis.</w:t>
+        <w:t>With ROC curve we will find confusion Metrix for this each threshold, the curved line are called ROC curve and the space under the curved line are called AUC, In Roc curve we will pot the True positive rate on y axis and False positive(wrong predictions) on x axis.</w:t>
       </w:r>
     </w:p>
     <w:p>
@@ -3044,62 +2651,20 @@
         <w:rPr>
           <w:lang w:val="en-US"/>
         </w:rPr>
-        <w:t xml:space="preserve">Higher ROC value will </w:t>
-      </w:r>
-      <w:proofErr w:type="gramStart"/>
-      <w:r>
-        <w:rPr>
-          <w:lang w:val="en-US"/>
-        </w:rPr>
-        <w:t>has</w:t>
-      </w:r>
-      <w:proofErr w:type="gramEnd"/>
-      <w:r>
-        <w:rPr>
-          <w:lang w:val="en-US"/>
-        </w:rPr>
-        <w:t xml:space="preserve"> the good model prediction rate.</w:t>
-      </w:r>
-    </w:p>
-    <w:p>
-      <w:pPr>
-        <w:rPr>
-          <w:lang w:val="en-US"/>
-        </w:rPr>
-      </w:pPr>
-      <w:r>
-        <w:rPr>
-          <w:lang w:val="en-US"/>
-        </w:rPr>
-        <w:t xml:space="preserve">Following </w:t>
-      </w:r>
-      <w:proofErr w:type="gramStart"/>
-      <w:r>
-        <w:rPr>
-          <w:lang w:val="en-US"/>
-        </w:rPr>
-        <w:t>image</w:t>
-      </w:r>
-      <w:proofErr w:type="gramEnd"/>
-      <w:r>
-        <w:rPr>
-          <w:lang w:val="en-US"/>
-        </w:rPr>
-        <w:t xml:space="preserve"> the example of both ROC and AUC, </w:t>
-      </w:r>
-      <w:proofErr w:type="gramStart"/>
-      <w:r>
-        <w:rPr>
-          <w:lang w:val="en-US"/>
-        </w:rPr>
-        <w:t>we  saw</w:t>
-      </w:r>
-      <w:proofErr w:type="gramEnd"/>
-      <w:r>
-        <w:rPr>
-          <w:lang w:val="en-US"/>
-        </w:rPr>
-        <w:t xml:space="preserve"> the performance of three classification model in this image. In this way we can find the best classification model, on the below image random forest classifier has the good prediction.</w:t>
+        <w:t>Higher ROC value will has the good model prediction rate.</w:t>
+      </w:r>
+    </w:p>
+    <w:p>
+      <w:pPr>
+        <w:rPr>
+          <w:lang w:val="en-US"/>
+        </w:rPr>
+      </w:pPr>
+      <w:r>
+        <w:rPr>
+          <w:lang w:val="en-US"/>
+        </w:rPr>
+        <w:t>Following image the example of both ROC and AUC, we  saw the performance of three classification model in this image. In this way we can find the best classification model, on the below image random forest classifier has the good prediction.</w:t>
       </w:r>
     </w:p>
     <w:p>
@@ -3336,48 +2901,12 @@
           <w:bCs/>
           <w:lang w:val="en-US"/>
         </w:rPr>
-        <w:t xml:space="preserve">Likelihood and </w:t>
-      </w:r>
-      <w:proofErr w:type="spellStart"/>
-      <w:r>
-        <w:rPr>
-          <w:b/>
-          <w:bCs/>
-          <w:lang w:val="en-US"/>
-        </w:rPr>
-        <w:t>prios</w:t>
-      </w:r>
-      <w:proofErr w:type="spellEnd"/>
-    </w:p>
-    <w:p>
-      <w:r>
-        <w:t xml:space="preserve">In below data set yellow highlight is </w:t>
-      </w:r>
-      <w:proofErr w:type="spellStart"/>
-      <w:proofErr w:type="gramStart"/>
-      <w:r>
-        <w:t>a</w:t>
-      </w:r>
-      <w:proofErr w:type="spellEnd"/>
-      <w:proofErr w:type="gramEnd"/>
-      <w:r>
-        <w:t xml:space="preserve"> </w:t>
-      </w:r>
-      <w:proofErr w:type="gramStart"/>
-      <w:r>
-        <w:t>event(</w:t>
-      </w:r>
-      <w:proofErr w:type="gramEnd"/>
-      <w:r>
-        <w:t xml:space="preserve">event A) that already occurred, blue highlight is the </w:t>
-      </w:r>
-      <w:proofErr w:type="gramStart"/>
-      <w:r>
-        <w:t>event(</w:t>
-      </w:r>
-      <w:proofErr w:type="gramEnd"/>
-      <w:r>
-        <w:t>event B) that are going to occur because of the event A.</w:t>
+        <w:t>Likelihood and prios</w:t>
+      </w:r>
+    </w:p>
+    <w:p>
+      <w:r>
+        <w:t>In below data set yellow highlight is a event(event A) that already occurred, blue highlight is the event(event B) that are going to occur because of the event A.</w:t>
       </w:r>
     </w:p>
     <w:p>
@@ -3397,17 +2926,7 @@
         <w:t>likelihood</w:t>
       </w:r>
       <w:r>
-        <w:t xml:space="preserve"> of </w:t>
-      </w:r>
-      <w:proofErr w:type="spellStart"/>
-      <w:proofErr w:type="gramStart"/>
-      <w:r>
-        <w:t>a</w:t>
-      </w:r>
-      <w:proofErr w:type="spellEnd"/>
-      <w:proofErr w:type="gramEnd"/>
-      <w:r>
-        <w:t xml:space="preserve"> event. And orange is called prior, a </w:t>
+        <w:t xml:space="preserve"> of a event. And orange is called prior, a </w:t>
       </w:r>
       <w:r>
         <w:rPr>
@@ -3616,15 +3135,14 @@
         <w:rPr>
           <w:b/>
           <w:bCs/>
-          <w:noProof/>
           <w:lang w:val="en-US"/>
         </w:rPr>
         <w:lastRenderedPageBreak/>
         <w:drawing>
-          <wp:inline distT="0" distB="0" distL="0" distR="0" wp14:anchorId="5A20F515" wp14:editId="3D671D64">
-            <wp:extent cx="4138019" cy="3566469"/>
-            <wp:effectExtent l="0" t="0" r="0" b="0"/>
-            <wp:docPr id="658448168" name="Picture 1"/>
+          <wp:inline distT="0" distB="0" distL="0" distR="0" wp14:anchorId="659FC136" wp14:editId="014C13BE">
+            <wp:extent cx="4777740" cy="2787015"/>
+            <wp:effectExtent l="0" t="0" r="3810" b="0"/>
+            <wp:docPr id="1921556938" name="Picture 1"/>
             <wp:cNvGraphicFramePr>
               <a:graphicFrameLocks xmlns:a="http://schemas.openxmlformats.org/drawingml/2006/main" noChangeAspect="1"/>
             </wp:cNvGraphicFramePr>
@@ -3632,7 +3150,7 @@
               <a:graphicData uri="http://schemas.openxmlformats.org/drawingml/2006/picture">
                 <pic:pic xmlns:pic="http://schemas.openxmlformats.org/drawingml/2006/picture">
                   <pic:nvPicPr>
-                    <pic:cNvPr id="658448168" name=""/>
+                    <pic:cNvPr id="1921556938" name=""/>
                     <pic:cNvPicPr/>
                   </pic:nvPicPr>
                   <pic:blipFill>
@@ -3644,7 +3162,7 @@
                   <pic:spPr>
                     <a:xfrm>
                       <a:off x="0" y="0"/>
-                      <a:ext cx="4138019" cy="3566469"/>
+                      <a:ext cx="4778157" cy="2787258"/>
                     </a:xfrm>
                     <a:prstGeom prst="rect">
                       <a:avLst/>
@@ -3671,6 +3189,211 @@
           <w:bCs/>
           <w:lang w:val="en-US"/>
         </w:rPr>
+        <w:drawing>
+          <wp:inline distT="0" distB="0" distL="0" distR="0" wp14:anchorId="5958A0E2" wp14:editId="2D031770">
+            <wp:extent cx="4076700" cy="3772556"/>
+            <wp:effectExtent l="0" t="0" r="0" b="0"/>
+            <wp:docPr id="1102759823" name="Picture 1"/>
+            <wp:cNvGraphicFramePr>
+              <a:graphicFrameLocks xmlns:a="http://schemas.openxmlformats.org/drawingml/2006/main" noChangeAspect="1"/>
+            </wp:cNvGraphicFramePr>
+            <a:graphic xmlns:a="http://schemas.openxmlformats.org/drawingml/2006/main">
+              <a:graphicData uri="http://schemas.openxmlformats.org/drawingml/2006/picture">
+                <pic:pic xmlns:pic="http://schemas.openxmlformats.org/drawingml/2006/picture">
+                  <pic:nvPicPr>
+                    <pic:cNvPr id="1102759823" name=""/>
+                    <pic:cNvPicPr/>
+                  </pic:nvPicPr>
+                  <pic:blipFill>
+                    <a:blip r:embed="rId31"/>
+                    <a:stretch>
+                      <a:fillRect/>
+                    </a:stretch>
+                  </pic:blipFill>
+                  <pic:spPr>
+                    <a:xfrm>
+                      <a:off x="0" y="0"/>
+                      <a:ext cx="4081369" cy="3776877"/>
+                    </a:xfrm>
+                    <a:prstGeom prst="rect">
+                      <a:avLst/>
+                    </a:prstGeom>
+                  </pic:spPr>
+                </pic:pic>
+              </a:graphicData>
+            </a:graphic>
+          </wp:inline>
+        </w:drawing>
+      </w:r>
+    </w:p>
+    <w:p>
+      <w:pPr>
+        <w:rPr>
+          <w:b/>
+          <w:bCs/>
+          <w:lang w:val="en-US"/>
+        </w:rPr>
+      </w:pPr>
+      <w:r>
+        <w:rPr>
+          <w:b/>
+          <w:bCs/>
+          <w:lang w:val="en-US"/>
+        </w:rPr>
+        <w:lastRenderedPageBreak/>
+        <w:drawing>
+          <wp:inline distT="0" distB="0" distL="0" distR="0" wp14:anchorId="30E1F5BE" wp14:editId="6D3171C9">
+            <wp:extent cx="3284220" cy="2812519"/>
+            <wp:effectExtent l="0" t="0" r="0" b="6985"/>
+            <wp:docPr id="1628110733" name="Picture 1"/>
+            <wp:cNvGraphicFramePr>
+              <a:graphicFrameLocks xmlns:a="http://schemas.openxmlformats.org/drawingml/2006/main" noChangeAspect="1"/>
+            </wp:cNvGraphicFramePr>
+            <a:graphic xmlns:a="http://schemas.openxmlformats.org/drawingml/2006/main">
+              <a:graphicData uri="http://schemas.openxmlformats.org/drawingml/2006/picture">
+                <pic:pic xmlns:pic="http://schemas.openxmlformats.org/drawingml/2006/picture">
+                  <pic:nvPicPr>
+                    <pic:cNvPr id="1628110733" name=""/>
+                    <pic:cNvPicPr/>
+                  </pic:nvPicPr>
+                  <pic:blipFill>
+                    <a:blip r:embed="rId32"/>
+                    <a:stretch>
+                      <a:fillRect/>
+                    </a:stretch>
+                  </pic:blipFill>
+                  <pic:spPr>
+                    <a:xfrm>
+                      <a:off x="0" y="0"/>
+                      <a:ext cx="3288416" cy="2816112"/>
+                    </a:xfrm>
+                    <a:prstGeom prst="rect">
+                      <a:avLst/>
+                    </a:prstGeom>
+                  </pic:spPr>
+                </pic:pic>
+              </a:graphicData>
+            </a:graphic>
+          </wp:inline>
+        </w:drawing>
+      </w:r>
+    </w:p>
+    <w:p>
+      <w:pPr>
+        <w:rPr>
+          <w:b/>
+          <w:bCs/>
+          <w:lang w:val="en-US"/>
+        </w:rPr>
+      </w:pPr>
+      <w:r>
+        <w:rPr>
+          <w:b/>
+          <w:bCs/>
+          <w:lang w:val="en-US"/>
+        </w:rPr>
+        <w:drawing>
+          <wp:inline distT="0" distB="0" distL="0" distR="0" wp14:anchorId="5793C3E7" wp14:editId="3FB68CFA">
+            <wp:extent cx="3703320" cy="2153637"/>
+            <wp:effectExtent l="0" t="0" r="0" b="0"/>
+            <wp:docPr id="1189917274" name="Picture 1"/>
+            <wp:cNvGraphicFramePr>
+              <a:graphicFrameLocks xmlns:a="http://schemas.openxmlformats.org/drawingml/2006/main" noChangeAspect="1"/>
+            </wp:cNvGraphicFramePr>
+            <a:graphic xmlns:a="http://schemas.openxmlformats.org/drawingml/2006/main">
+              <a:graphicData uri="http://schemas.openxmlformats.org/drawingml/2006/picture">
+                <pic:pic xmlns:pic="http://schemas.openxmlformats.org/drawingml/2006/picture">
+                  <pic:nvPicPr>
+                    <pic:cNvPr id="1189917274" name=""/>
+                    <pic:cNvPicPr/>
+                  </pic:nvPicPr>
+                  <pic:blipFill>
+                    <a:blip r:embed="rId33"/>
+                    <a:stretch>
+                      <a:fillRect/>
+                    </a:stretch>
+                  </pic:blipFill>
+                  <pic:spPr>
+                    <a:xfrm>
+                      <a:off x="0" y="0"/>
+                      <a:ext cx="3709200" cy="2157057"/>
+                    </a:xfrm>
+                    <a:prstGeom prst="rect">
+                      <a:avLst/>
+                    </a:prstGeom>
+                  </pic:spPr>
+                </pic:pic>
+              </a:graphicData>
+            </a:graphic>
+          </wp:inline>
+        </w:drawing>
+      </w:r>
+    </w:p>
+    <w:p>
+      <w:pPr>
+        <w:rPr>
+          <w:b/>
+          <w:bCs/>
+          <w:lang w:val="en-US"/>
+        </w:rPr>
+      </w:pPr>
+      <w:r>
+        <w:rPr>
+          <w:b/>
+          <w:bCs/>
+          <w:lang w:val="en-US"/>
+        </w:rPr>
+        <w:drawing>
+          <wp:inline distT="0" distB="0" distL="0" distR="0" wp14:anchorId="4118FF51" wp14:editId="7A265294">
+            <wp:extent cx="3307080" cy="1567848"/>
+            <wp:effectExtent l="0" t="0" r="7620" b="0"/>
+            <wp:docPr id="1401162196" name="Picture 1"/>
+            <wp:cNvGraphicFramePr>
+              <a:graphicFrameLocks xmlns:a="http://schemas.openxmlformats.org/drawingml/2006/main" noChangeAspect="1"/>
+            </wp:cNvGraphicFramePr>
+            <a:graphic xmlns:a="http://schemas.openxmlformats.org/drawingml/2006/main">
+              <a:graphicData uri="http://schemas.openxmlformats.org/drawingml/2006/picture">
+                <pic:pic xmlns:pic="http://schemas.openxmlformats.org/drawingml/2006/picture">
+                  <pic:nvPicPr>
+                    <pic:cNvPr id="1401162196" name=""/>
+                    <pic:cNvPicPr/>
+                  </pic:nvPicPr>
+                  <pic:blipFill>
+                    <a:blip r:embed="rId34"/>
+                    <a:stretch>
+                      <a:fillRect/>
+                    </a:stretch>
+                  </pic:blipFill>
+                  <pic:spPr>
+                    <a:xfrm>
+                      <a:off x="0" y="0"/>
+                      <a:ext cx="3311961" cy="1570162"/>
+                    </a:xfrm>
+                    <a:prstGeom prst="rect">
+                      <a:avLst/>
+                    </a:prstGeom>
+                  </pic:spPr>
+                </pic:pic>
+              </a:graphicData>
+            </a:graphic>
+          </wp:inline>
+        </w:drawing>
+      </w:r>
+    </w:p>
+    <w:p>
+      <w:pPr>
+        <w:rPr>
+          <w:b/>
+          <w:bCs/>
+          <w:lang w:val="en-US"/>
+        </w:rPr>
+      </w:pPr>
+      <w:r>
+        <w:rPr>
+          <w:b/>
+          <w:bCs/>
+          <w:lang w:val="en-US"/>
+        </w:rPr>
         <w:t xml:space="preserve">25. </w:t>
       </w:r>
     </w:p>
@@ -3746,6 +3469,7 @@
     </w:p>
     <w:p>
       <w:r>
+        <w:lastRenderedPageBreak/>
         <w:t xml:space="preserve">The line which separates the red and green are also called </w:t>
       </w:r>
       <w:r>
@@ -3756,15 +3480,7 @@
         <w:t xml:space="preserve">threshold </w:t>
       </w:r>
       <w:r>
-        <w:t xml:space="preserve">value for 1D vector it is called as point for </w:t>
-      </w:r>
-      <w:proofErr w:type="gramStart"/>
-      <w:r>
-        <w:t>From</w:t>
-      </w:r>
-      <w:proofErr w:type="gramEnd"/>
-      <w:r>
-        <w:t xml:space="preserve"> 2d it is also called ad threshold or hyperplane. And a point near to the threshold are called </w:t>
+        <w:t xml:space="preserve">value for 1D vector it is called as point for From 2d it is also called ad threshold or hyperplane. And a point near to the threshold are called </w:t>
       </w:r>
       <w:r>
         <w:rPr>
@@ -3784,6 +3500,9 @@
         </w:rPr>
       </w:pPr>
       <w:r>
+        <w:rPr>
+          <w:noProof/>
+        </w:rPr>
         <w:drawing>
           <wp:inline distT="0" distB="0" distL="0" distR="0" wp14:anchorId="1B3D1982" wp14:editId="12084CEC">
             <wp:extent cx="3254022" cy="1044030"/>
@@ -3800,7 +3519,7 @@
                     <pic:cNvPicPr/>
                   </pic:nvPicPr>
                   <pic:blipFill>
-                    <a:blip r:embed="rId31"/>
+                    <a:blip r:embed="rId35"/>
                     <a:stretch>
                       <a:fillRect/>
                     </a:stretch>
@@ -3858,23 +3577,13 @@
         <w:t xml:space="preserve">Polynomial kernel function – </w:t>
       </w:r>
       <w:r>
-        <w:t xml:space="preserve">It tries to fit a </w:t>
-      </w:r>
-      <w:proofErr w:type="gramStart"/>
-      <w:r>
-        <w:t>polynomial(</w:t>
-      </w:r>
-      <w:proofErr w:type="gramEnd"/>
-      <w:r>
-        <w:t xml:space="preserve">curved linear line) line to the dataset to make all the data separable, </w:t>
-      </w:r>
-      <w:proofErr w:type="gramStart"/>
-      <w:r>
-        <w:t>Takes</w:t>
-      </w:r>
-      <w:proofErr w:type="gramEnd"/>
-      <w:r>
-        <w:t xml:space="preserve"> argument d which says the dim that are going to be changed, it is used with cross validations to find the optimal d value</w:t>
+        <w:t>It tries to fit a polynomial(curved linear line) li</w:t>
+      </w:r>
+      <w:r>
+        <w:t>o</w:t>
+      </w:r>
+      <w:r>
+        <w:t>ne to the dataset to make all the data separable, Takes argument d which says the dim that are going to be changed, it is used with cross validations to find the optimal d value</w:t>
       </w:r>
     </w:p>
     <w:p>
@@ -3903,11 +3612,231 @@
           <w:b/>
           <w:bCs/>
         </w:rPr>
+        <w:t xml:space="preserve">Radial kernel function – </w:t>
+      </w:r>
+      <w:r>
+        <w:t>This automatically chooses a dim to make all the data separable, it doesn’t take d argument</w:t>
+      </w:r>
+    </w:p>
+    <w:p>
+      <w:pPr>
+        <w:pStyle w:val="ListParagraph"/>
+        <w:rPr>
+          <w:b/>
+          <w:bCs/>
+        </w:rPr>
+      </w:pPr>
+    </w:p>
+    <w:p>
+      <w:pPr>
+        <w:rPr>
+          <w:b/>
+          <w:bCs/>
+        </w:rPr>
+      </w:pPr>
+      <w:r>
+        <w:rPr>
+          <w:b/>
+          <w:bCs/>
+        </w:rPr>
+        <w:t>27.</w:t>
+      </w:r>
+    </w:p>
+    <w:p>
+      <w:pPr>
+        <w:rPr>
+          <w:b/>
+          <w:bCs/>
+        </w:rPr>
+      </w:pPr>
+      <w:r>
+        <w:rPr>
+          <w:b/>
+          <w:bCs/>
+        </w:rPr>
+        <w:drawing>
+          <wp:inline distT="0" distB="0" distL="0" distR="0" wp14:anchorId="4767E584" wp14:editId="7C4DE44D">
+            <wp:extent cx="3924300" cy="1087097"/>
+            <wp:effectExtent l="0" t="0" r="0" b="0"/>
+            <wp:docPr id="1332123791" name="Picture 1"/>
+            <wp:cNvGraphicFramePr>
+              <a:graphicFrameLocks xmlns:a="http://schemas.openxmlformats.org/drawingml/2006/main" noChangeAspect="1"/>
+            </wp:cNvGraphicFramePr>
+            <a:graphic xmlns:a="http://schemas.openxmlformats.org/drawingml/2006/main">
+              <a:graphicData uri="http://schemas.openxmlformats.org/drawingml/2006/picture">
+                <pic:pic xmlns:pic="http://schemas.openxmlformats.org/drawingml/2006/picture">
+                  <pic:nvPicPr>
+                    <pic:cNvPr id="1332123791" name=""/>
+                    <pic:cNvPicPr/>
+                  </pic:nvPicPr>
+                  <pic:blipFill>
+                    <a:blip r:embed="rId36"/>
+                    <a:stretch>
+                      <a:fillRect/>
+                    </a:stretch>
+                  </pic:blipFill>
+                  <pic:spPr>
+                    <a:xfrm>
+                      <a:off x="0" y="0"/>
+                      <a:ext cx="3935840" cy="1090294"/>
+                    </a:xfrm>
+                    <a:prstGeom prst="rect">
+                      <a:avLst/>
+                    </a:prstGeom>
+                  </pic:spPr>
+                </pic:pic>
+              </a:graphicData>
+            </a:graphic>
+          </wp:inline>
+        </w:drawing>
+      </w:r>
+    </w:p>
+    <w:p>
+      <w:pPr>
+        <w:rPr>
+          <w:b/>
+          <w:bCs/>
+        </w:rPr>
+      </w:pPr>
+      <w:r>
+        <w:rPr>
+          <w:b/>
+          <w:bCs/>
+        </w:rPr>
+        <w:drawing>
+          <wp:inline distT="0" distB="0" distL="0" distR="0" wp14:anchorId="1B7CAAC2" wp14:editId="54FA8552">
+            <wp:extent cx="3771900" cy="3363096"/>
+            <wp:effectExtent l="0" t="0" r="0" b="8890"/>
+            <wp:docPr id="1280601578" name="Picture 1"/>
+            <wp:cNvGraphicFramePr>
+              <a:graphicFrameLocks xmlns:a="http://schemas.openxmlformats.org/drawingml/2006/main" noChangeAspect="1"/>
+            </wp:cNvGraphicFramePr>
+            <a:graphic xmlns:a="http://schemas.openxmlformats.org/drawingml/2006/main">
+              <a:graphicData uri="http://schemas.openxmlformats.org/drawingml/2006/picture">
+                <pic:pic xmlns:pic="http://schemas.openxmlformats.org/drawingml/2006/picture">
+                  <pic:nvPicPr>
+                    <pic:cNvPr id="1280601578" name=""/>
+                    <pic:cNvPicPr/>
+                  </pic:nvPicPr>
+                  <pic:blipFill>
+                    <a:blip r:embed="rId37"/>
+                    <a:stretch>
+                      <a:fillRect/>
+                    </a:stretch>
+                  </pic:blipFill>
+                  <pic:spPr>
+                    <a:xfrm>
+                      <a:off x="0" y="0"/>
+                      <a:ext cx="3776351" cy="3367064"/>
+                    </a:xfrm>
+                    <a:prstGeom prst="rect">
+                      <a:avLst/>
+                    </a:prstGeom>
+                  </pic:spPr>
+                </pic:pic>
+              </a:graphicData>
+            </a:graphic>
+          </wp:inline>
+        </w:drawing>
+      </w:r>
+    </w:p>
+    <w:p>
+      <w:pPr>
+        <w:rPr>
+          <w:b/>
+          <w:bCs/>
+        </w:rPr>
+      </w:pPr>
+      <w:r>
+        <w:rPr>
+          <w:b/>
+          <w:bCs/>
+        </w:rPr>
         <w:lastRenderedPageBreak/>
-        <w:t xml:space="preserve">Radial kernel function – </w:t>
-      </w:r>
-      <w:r>
-        <w:t>This automatically chooses a dim to make all the data separable, it doesn’t take d argument</w:t>
+        <w:drawing>
+          <wp:inline distT="0" distB="0" distL="0" distR="0" wp14:anchorId="43E6B32C" wp14:editId="541ABC64">
+            <wp:extent cx="4137660" cy="1900259"/>
+            <wp:effectExtent l="0" t="0" r="0" b="5080"/>
+            <wp:docPr id="778333116" name="Picture 1"/>
+            <wp:cNvGraphicFramePr>
+              <a:graphicFrameLocks xmlns:a="http://schemas.openxmlformats.org/drawingml/2006/main" noChangeAspect="1"/>
+            </wp:cNvGraphicFramePr>
+            <a:graphic xmlns:a="http://schemas.openxmlformats.org/drawingml/2006/main">
+              <a:graphicData uri="http://schemas.openxmlformats.org/drawingml/2006/picture">
+                <pic:pic xmlns:pic="http://schemas.openxmlformats.org/drawingml/2006/picture">
+                  <pic:nvPicPr>
+                    <pic:cNvPr id="778333116" name=""/>
+                    <pic:cNvPicPr/>
+                  </pic:nvPicPr>
+                  <pic:blipFill>
+                    <a:blip r:embed="rId38"/>
+                    <a:stretch>
+                      <a:fillRect/>
+                    </a:stretch>
+                  </pic:blipFill>
+                  <pic:spPr>
+                    <a:xfrm>
+                      <a:off x="0" y="0"/>
+                      <a:ext cx="4151210" cy="1906482"/>
+                    </a:xfrm>
+                    <a:prstGeom prst="rect">
+                      <a:avLst/>
+                    </a:prstGeom>
+                  </pic:spPr>
+                </pic:pic>
+              </a:graphicData>
+            </a:graphic>
+          </wp:inline>
+        </w:drawing>
+      </w:r>
+    </w:p>
+    <w:p>
+      <w:pPr>
+        <w:rPr>
+          <w:b/>
+          <w:bCs/>
+        </w:rPr>
+      </w:pPr>
+      <w:r>
+        <w:rPr>
+          <w:b/>
+          <w:bCs/>
+        </w:rPr>
+        <w:drawing>
+          <wp:inline distT="0" distB="0" distL="0" distR="0" wp14:anchorId="4B92C136" wp14:editId="5B14FC4E">
+            <wp:extent cx="4221480" cy="3144572"/>
+            <wp:effectExtent l="0" t="0" r="7620" b="0"/>
+            <wp:docPr id="355169678" name="Picture 1"/>
+            <wp:cNvGraphicFramePr>
+              <a:graphicFrameLocks xmlns:a="http://schemas.openxmlformats.org/drawingml/2006/main" noChangeAspect="1"/>
+            </wp:cNvGraphicFramePr>
+            <a:graphic xmlns:a="http://schemas.openxmlformats.org/drawingml/2006/main">
+              <a:graphicData uri="http://schemas.openxmlformats.org/drawingml/2006/picture">
+                <pic:pic xmlns:pic="http://schemas.openxmlformats.org/drawingml/2006/picture">
+                  <pic:nvPicPr>
+                    <pic:cNvPr id="355169678" name=""/>
+                    <pic:cNvPicPr/>
+                  </pic:nvPicPr>
+                  <pic:blipFill>
+                    <a:blip r:embed="rId39"/>
+                    <a:stretch>
+                      <a:fillRect/>
+                    </a:stretch>
+                  </pic:blipFill>
+                  <pic:spPr>
+                    <a:xfrm>
+                      <a:off x="0" y="0"/>
+                      <a:ext cx="4230613" cy="3151375"/>
+                    </a:xfrm>
+                    <a:prstGeom prst="rect">
+                      <a:avLst/>
+                    </a:prstGeom>
+                  </pic:spPr>
+                </pic:pic>
+              </a:graphicData>
+            </a:graphic>
+          </wp:inline>
+        </w:drawing>
       </w:r>
     </w:p>
     <w:p>

</xml_diff>

<commit_message>
View formed decision tree in sklearn
</commit_message>
<xml_diff>
--- a/machine_learning_basics/mlbasics_test.docx
+++ b/machine_learning_basics/mlbasics_test.docx
@@ -99,6 +99,9 @@
       <w:r>
         <w:t xml:space="preserve"> What is c4.5 algorithm and cart algorithm, explain the measurement used in those algorithms.</w:t>
       </w:r>
+      <w:r>
+        <w:t xml:space="preserve"> How can we see decision tree formed by model in sklearn</w:t>
+      </w:r>
     </w:p>
     <w:p>
       <w:r>
@@ -196,6 +199,12 @@
     <w:p>
       <w:r>
         <w:t>27. How can you use svm from sicikit learn with kernel function, and what is the use of c hyper parameter in svm.</w:t>
+      </w:r>
+    </w:p>
+    <w:p>
+      <w:r>
+        <w:lastRenderedPageBreak/>
+        <w:t>28. What are the steps to build and select good model</w:t>
       </w:r>
     </w:p>
     <w:p/>

</xml_diff>